<commit_message>
docs: Propuesta final tras revision del equipo
</commit_message>
<xml_diff>
--- a/docs/Analisis_de_Requerimientos.docx
+++ b/docs/Analisis_de_Requerimientos.docx
@@ -23,12 +23,12 @@
           <wp:inline distB="114300" distT="114300" distL="114300" distR="114300">
             <wp:extent cx="3291196" cy="1204913"/>
             <wp:effectExtent b="0" l="0" r="0" t="0"/>
-            <wp:docPr id="1" name="image1.png"/>
+            <wp:docPr id="2" name="image2.png"/>
             <a:graphic>
               <a:graphicData uri="http://schemas.openxmlformats.org/drawingml/2006/picture">
                 <pic:pic>
                   <pic:nvPicPr>
-                    <pic:cNvPr id="0" name="image1.png"/>
+                    <pic:cNvPr id="0" name="image2.png"/>
                     <pic:cNvPicPr preferRelativeResize="0"/>
                   </pic:nvPicPr>
                   <pic:blipFill>
@@ -5966,20 +5966,20 @@
           <wp:anchor allowOverlap="1" behindDoc="0" distB="114300" distT="114300" distL="114300" distR="114300" hidden="0" layoutInCell="1" locked="0" relativeHeight="0" simplePos="0">
             <wp:simplePos x="0" y="0"/>
             <wp:positionH relativeFrom="column">
-              <wp:posOffset>-128587</wp:posOffset>
+              <wp:posOffset>114300</wp:posOffset>
             </wp:positionH>
             <wp:positionV relativeFrom="paragraph">
-              <wp:posOffset>165100</wp:posOffset>
+              <wp:posOffset>190500</wp:posOffset>
             </wp:positionV>
-            <wp:extent cx="6186488" cy="4758837"/>
+            <wp:extent cx="6019800" cy="4003953"/>
             <wp:effectExtent b="0" l="0" r="0" t="0"/>
             <wp:wrapSquare wrapText="bothSides" distB="114300" distT="114300" distL="114300" distR="114300"/>
-            <wp:docPr id="2" name="image2.png"/>
+            <wp:docPr id="1" name="image1.png"/>
             <a:graphic>
               <a:graphicData uri="http://schemas.openxmlformats.org/drawingml/2006/picture">
                 <pic:pic>
                   <pic:nvPicPr>
-                    <pic:cNvPr id="0" name="image2.png"/>
+                    <pic:cNvPr id="0" name="image1.png"/>
                     <pic:cNvPicPr preferRelativeResize="0"/>
                   </pic:nvPicPr>
                   <pic:blipFill>
@@ -5992,7 +5992,7 @@
                   <pic:spPr>
                     <a:xfrm>
                       <a:off x="0" y="0"/>
-                      <a:ext cx="6186488" cy="4758837"/>
+                      <a:ext cx="6019800" cy="4003953"/>
                     </a:xfrm>
                     <a:prstGeom prst="rect"/>
                     <a:ln/>
@@ -6020,22 +6020,6 @@
         </w:rPr>
         <w:t xml:space="preserve">La tabla del ML Canvas y su desarrollo narrativo deberán expresar el objetivo confirmado de salidas por estación y día. La imagen del lienzo anterior conserva el enfoque de entradas y salidas a tres días y deberá sustituirse antes de entregar.</w:t>
       </w:r>
-      <w:r>
-        <w:rPr>
-          <w:rtl w:val="0"/>
-        </w:rPr>
-      </w:r>
-    </w:p>
-    <w:p>
-      <w:pPr>
-        <w:spacing w:after="160" w:before="240" w:lineRule="auto"/>
-        <w:rPr>
-          <w:b w:val="1"/>
-          <w:bCs w:val="1"/>
-          <w:sz w:val="24"/>
-          <w:szCs w:val="24"/>
-        </w:rPr>
-      </w:pPr>
       <w:r>
         <w:rPr>
           <w:rtl w:val="0"/>

</xml_diff>